<commit_message>
Strip em-dashes from public-repo docs; mirror Paper 2 cleanup
</commit_message>
<xml_diff>
--- a/SP_Magazine_2026/COVER_LETTER.docx
+++ b/SP_Magazine_2026/COVER_LETTER.docx
@@ -8,7 +8,7 @@
         <w:pStyle w:val="Heading1"/>
       </w:pPr>
       <w:r>
-        <w:t xml:space="preserve">Cover Letter — IEEE Security &amp; Privacy Magazine</w:t>
+        <w:t xml:space="preserve">Cover Letter: IEEE Security &amp; Privacy Magazine</w:t>
       </w:r>
     </w:p>
     <w:p>
@@ -108,7 +108,7 @@
           <w:iCs/>
           <w:i/>
         </w:rPr>
-        <w:t xml:space="preserve">¹DNS Research Lab, University College Dublin · ²BGD e-GOV CIRT, Dhaka, Bangladesh · ³EIC Limited, Dhaka, Bangladesh · ⁴School of Computer Science, University College Dublin, Ireland.</w:t>
+        <w:t xml:space="preserve">¹DNS Research Lab; ²BGD e-GOV CIRT, Dhaka, Bangladesh; ³EIC Limited, Dhaka, Bangladesh; ⁴School of Computer Science, University College Dublin, Ireland.</w:t>
       </w:r>
     </w:p>
     <w:p>
@@ -180,7 +180,7 @@
         <w:t xml:space="preserve"> </w:t>
       </w:r>
       <w:r>
-        <w:t xml:space="preserve">Autonomous AI agents are now triaging alerts, enriching incidents, and recommending containment actions in production Security Operations Centres. Yet the conditions under which they fail — and the operational consequences of those failures — remain poorly characterised. This article provides a practical reliability framework,</w:t>
+        <w:t xml:space="preserve">Autonomous AI agents are now triaging alerts, enriching incidents, and recommending containment actions in production Security Operations Centres. Yet the conditions under which they fail, and the operational consequences of those failures, remain poorly characterised. This article provides a practical reliability framework,</w:t>
       </w:r>
       <w:r>
         <w:t xml:space="preserve"> </w:t>
@@ -193,7 +193,7 @@
         <w:t xml:space="preserve">ARES</w:t>
       </w:r>
       <w:r>
-        <w:t xml:space="preserve">, that translates failures into measurable risk: a five-dimensional Skill–Knowledge–Capability mismatch model, an Agent Reliability Score, and an Epistemic Gap metric that captures</w:t>
+        <w:t xml:space="preserve">, that translates failures into measurable risk: a five-dimensional Skill, Knowledge, and Capability mismatch model, an Agent Reliability Score, and an Epistemic Gap metric that captures</w:t>
       </w:r>
       <w:r>
         <w:t xml:space="preserve"> </w:t>
@@ -323,7 +323,7 @@
         <w:t xml:space="preserve"> </w:t>
       </w:r>
       <w:r>
-        <w:t xml:space="preserve">DNS Research Lab, University College Dublin</w:t>
+        <w:t xml:space="preserve">DNS Research Lab</w:t>
       </w:r>
       <w:r>
         <w:t xml:space="preserve"> </w:t>

</xml_diff>